<commit_message>
Correct concentration share (79%) and inflation correlation wording; use clean dashboard screenshots in slides
- Top 20 economies generate ~79% of GDP (was stated as 80%)
- r = -0.32 is inflation vs life expectancy, not vs GDP growth
- Replace full-window screenshots in slides 4-7 with cropped dashboard captures

Co-Authored-By: Claude Sonnet 5.5 <noreply@anthropic.com>
Claude-Session: https://claude.ai/code/session_013MHPZvP2Ey2AqucN38CTZF
</commit_message>
<xml_diff>
--- a/docs/Documentation_and_Insights_Report.docx
+++ b/docs/Documentation_and_Insights_Report.docx
@@ -2247,7 +2247,7 @@
           <w:color w:val="0F172A"/>
           <w:sz w:val="22"/>
         </w:rPr>
-        <w:t>Out of 229 populated countries and territories totaling $55.64 trillion in global GDP, just 20 economies in the High GDP tier (&gt;= $500B) generate over 80% of world output, led by the United States ($11.75T), China ($7.26T), Japan ($3.75T), and India ($3.32T).</w:t>
+        <w:t>Out of 229 populated countries and territories totaling $55.64 trillion in global GDP, just 20 economies in the High GDP tier (&gt;= $500B) generate about 79% of world output, led by the United States ($11.75T), China ($7.26T), Japan ($3.75T), and India ($3.32T).</w:t>
       </w:r>
     </w:p>
     <w:p>
@@ -2308,7 +2308,7 @@
           <w:color w:val="0F172A"/>
           <w:sz w:val="22"/>
         </w:rPr>
-        <w:t xml:space="preserve">4. Hyperinflation Erodes Real Growth and Health Outcomes (r = -0.32): </w:t>
+        <w:t xml:space="preserve">4. High Inflation Is Linked to Weaker Health Outcomes (r = -0.32 with life expectancy): </w:t>
       </w:r>
       <w:r>
         <w:rPr>
@@ -2316,7 +2316,7 @@
           <w:color w:val="0F172A"/>
           <w:sz w:val="22"/>
         </w:rPr>
-        <w:t>Economies suffering severe price instability experience sharp economic contraction and depressed longevity; Zimbabwe records the highest inflation rate globally (133.0%) alongside the deepest real GDP contraction (-8.2%) and a 36.67-year life expectancy.</w:t>
+        <w:t>Economies with severe price instability tend to have shorter life expectancy; Zimbabwe records the highest inflation rate globally (133.0%) alongside the deepest real GDP contraction (-8.2%) and a 36.67-year life expectancy.</w:t>
       </w:r>
     </w:p>
     <w:p>

</xml_diff>